<commit_message>
before converting JSX to literal text
</commit_message>
<xml_diff>
--- a/Top 5 Free User Testing Platforms in 2026 - Test4Test Blog Post.docx
+++ b/Top 5 Free User Testing Platforms in 2026 - Test4Test Blog Post.docx
@@ -84,13 +84,12 @@
           <w:rFonts w:ascii="Arial" w:hAnsi="Arial" w:eastAsia="Arial"/>
           <w:b/>
         </w:rPr>
-        <w:t xml:space="preserve">Meta description: </w:t>
+        <w:t>Meta description: Compare five user testing platforms for founders in 2026, including Test4Test's recording-only credit exchange and managed tester packages.</w:t>
       </w:r>
       <w:r>
         <w:rPr>
           <w:rFonts w:ascii="Arial" w:hAnsi="Arial" w:eastAsia="Arial"/>
         </w:rPr>
-        <w:t>Compare five free user testing platforms for founders in 2026: Test4Test, Userbrain, Lookback, Lyssna, and Listen Labs.</w:t>
       </w:r>
     </w:p>
     <w:p>
@@ -138,13 +137,12 @@
           <w:rFonts w:ascii="Arial" w:hAnsi="Arial" w:eastAsia="Arial"/>
           <w:b/>
         </w:rPr>
-        <w:t xml:space="preserve">Excerpt: </w:t>
+        <w:t>Excerpt: A founder guide to five free user testing platforms, including Test4Test's recording-only credit exchange and managed tester packages.</w:t>
       </w:r>
       <w:r>
         <w:rPr>
           <w:rFonts w:ascii="Arial" w:hAnsi="Arial" w:eastAsia="Arial"/>
         </w:rPr>
-        <w:t>An every day founder guide to five free user testing platforms that give you real user feedback.</w:t>
       </w:r>
     </w:p>
     <w:p>
@@ -286,7 +284,7 @@
         <w:rPr>
           <w:rFonts w:ascii="Arial" w:hAnsi="Arial" w:eastAsia="Arial"/>
         </w:rPr>
-        <w:t>Test4Test is the only platform that gives you access to a whole community of testers for free. It also gives you access to the most impactful user testing tool: screen recordings.</w:t>
+        <w:t>Test4Test is a recording-only usability testing platform. You create 1-5 tasks, share a public test link, and receive screen-and-voice recordings from real people.</w:t>
       </w:r>
     </w:p>
     <w:p>
@@ -297,7 +295,7 @@
         <w:rPr>
           <w:rFonts w:ascii="Arial" w:hAnsi="Arial" w:eastAsia="Arial"/>
         </w:rPr>
-        <w:t>The tester community on Test4Test is supported by an advanced test-back and satisfaction rating system. You earn credits by testing other users' apps and websites. 1 credit = 1 test. There is no middleman that profits from your efforts. When you complete a test, your test moves up the ranks and is seen by more testers. Also, if you receive good feedback, your test will also move up the ranks.</w:t>
+        <w:t>The free side runs as a test-back credit exchange: one approved recording earns one credit, and one credit brings one community recording back to your app. There is no starter credit. Owners can optionally rate a recording from 1 to 5 stars, which helps build tester reputation.</w:t>
       </w:r>
     </w:p>
     <w:p>
@@ -308,7 +306,7 @@
         <w:rPr>
           <w:rFonts w:ascii="Arial" w:hAnsi="Arial" w:eastAsia="Arial"/>
         </w:rPr>
-        <w:t>Screen recordings let you see how users actually use your app firsthand. Most services charge for this. With Test4Test, it is 100% free. No trials. No credit card. No limits! This is one of the most important parts of usability testing, and any senior UX researcher will repeat this.</w:t>
+        <w:t>Each recording has a timestamped transcript so owners can review what happened alongside the video, mark useful and not-useful passages, and turn the strongest evidence into improvement priorities or shareable clips. Recordings and their derived transcripts and clips are retained for 60 days, and owners can delete them sooner.</w:t>
       </w:r>
     </w:p>
     <w:p>
@@ -319,7 +317,7 @@
         <w:rPr>
           <w:rFonts w:ascii="Arial" w:hAnsi="Arial" w:eastAsia="Arial"/>
         </w:rPr>
-        <w:t>Test4Test does not currently offer a paid version, so take advantage while you can.</w:t>
+        <w:t>Teams that want help finding participants can purchase managed 3-, 5-, or 10-tester packages. Test4Test recruits target-matched people from relevant social communities through a human-managed service; the participants complete the same recording flow through a public test link.</w:t>
       </w:r>
     </w:p>
     <w:p>
@@ -495,7 +493,7 @@
         <w:rPr>
           <w:rFonts w:ascii="Arial" w:hAnsi="Arial" w:eastAsia="Arial"/>
         </w:rPr>
-        <w:t>In conclusion, Test4Test takes the cake for accessing a large tester community and accessing a live recording feature within seconds of signing up. Userbrain is not far behind. They offer two free unmoderated user testing sessions, and you do not have to pay at all. Lastly, Listen Labs is extremely useful for primary research. Although it does not offer user recordings yet, conducting automated AI interviews with real participants in seconds is honestly amazing.</w:t>
+        <w:t>In conclusion, Test4Test stands out for recording-only tests and two ways to reach real people: a free test-back credit exchange and optional human-managed tester packages. Userbrain is not far behind; it offers two free unmoderated sessions. Lastly, Listen Labs is useful for primary research, pairing automated AI interviews with real participants.</w:t>
       </w:r>
     </w:p>
     <w:p>
@@ -545,13 +543,12 @@
           <w:rFonts w:ascii="Arial" w:hAnsi="Arial" w:eastAsia="Arial"/>
           <w:b/>
         </w:rPr>
-        <w:t xml:space="preserve">What changed: </w:t>
+        <w:t>What changed: Aligned the Test4Test sections with the recording-only product, free credit exchange, 60-day retention, and human-managed 3-, 5-, and 10-tester packages. Other platform sections remain unchanged.</w:t>
       </w:r>
       <w:r>
         <w:rPr>
           <w:rFonts w:ascii="Arial" w:hAnsi="Arial" w:eastAsia="Arial"/>
         </w:rPr>
-        <w:t>Restored the article close to the original draft and kept edits limited to spelling, grammar, punctuation, and small syntax fixes. Kept the original specific numbers.</w:t>
       </w:r>
     </w:p>
     <w:p>

</xml_diff>